<commit_message>
c218: Suppl I extended 9 -> 13 figures + rebuild builds
Suppl I gains four new sections (Extended HIDSAG corner plots,
PORPHYRY hammock, Cross-method top-word lambda comparison) embedding
the c214-c217 figures with captions citing Schonlau 2025 (hammock).
Figure inventory in /Why these thirteen figures/ updated. 'thirteen
figures' answer table extended with the new cognitive questions.

bibliography/refs.bib adds schonlau2025hammock arXiv entry.

Builds regenerated (Suppl I PDF + DOCX; both manuscript PDFs +
DOCX rebuilt after refs.bib change). All 16 build artefacts now
ship the latest content.

figures/README.md catalogues the 4 new figures.
</commit_message>
<xml_diff>
--- a/supplementary/word/journal/suppl_I_topic_label_relations.docx
+++ b/supplementary/word/journal/suppl_I_topic_label_relations.docx
@@ -2015,13 +2015,604 @@
     </w:p>
     <w:bookmarkEnd w:id="51"/>
     <w:bookmarkEnd w:id="52"/>
-    <w:bookmarkStart w:id="72" w:name="why-these-nine-figures"/>
+    <w:bookmarkStart w:id="61" w:name="X37330c6068c1da7a7b50205cf3e2eab20a13b92"/>
     <w:p>
       <w:pPr>
         <w:pStyle w:val="Heading1"/>
       </w:pPr>
       <w:r>
-        <w:t xml:space="preserve">Why these nine figures</w:t>
+        <w:t xml:space="preserve">Extended HIDSAG corner plots: MINERAL2 + PORPHYRY</w:t>
+      </w:r>
+    </w:p>
+    <w:bookmarkStart w:id="56" w:name="fig:corner-mineral2"/>
+    <w:p>
+      <w:pPr>
+        <w:pStyle w:val="CaptionedFigure"/>
+      </w:pPr>
+      <w:r>
+        <w:drawing>
+          <wp:inline>
+            <wp:extent cx="5334000" cy="5159523"/>
+            <wp:effectExtent b="0" l="0" r="0" t="0"/>
+            <wp:docPr descr="" title="" id="54" name="Picture"/>
+            <a:graphic>
+              <a:graphicData uri="http://schemas.openxmlformats.org/drawingml/2006/picture">
+                <pic:pic>
+                  <pic:nvPicPr>
+                    <pic:cNvPr descr="hidsag-corner-mineral2.pdf" id="55" name="Picture"/>
+                    <pic:cNvPicPr>
+                      <a:picLocks noChangeArrowheads="1" noChangeAspect="1"/>
+                    </pic:cNvPicPr>
+                  </pic:nvPicPr>
+                  <pic:blipFill>
+                    <a:blip r:embed="rId53"/>
+                    <a:stretch>
+                      <a:fillRect/>
+                    </a:stretch>
+                  </pic:blipFill>
+                  <pic:spPr bwMode="auto">
+                    <a:xfrm>
+                      <a:off x="0" y="0"/>
+                      <a:ext cx="5334000" cy="5159523"/>
+                    </a:xfrm>
+                    <a:prstGeom prst="rect">
+                      <a:avLst/>
+                    </a:prstGeom>
+                    <a:noFill/>
+                    <a:ln w="9525">
+                      <a:noFill/>
+                      <a:headEnd/>
+                      <a:tailEnd/>
+                    </a:ln>
+                  </pic:spPr>
+                </pic:pic>
+              </a:graphicData>
+            </a:graphic>
+          </wp:inline>
+        </w:drawing>
+      </w:r>
+    </w:p>
+    <w:p>
+      <w:pPr>
+        <w:pStyle w:val="ImageCaption"/>
+      </w:pPr>
+      <w:r>
+        <w:t xml:space="preserve">MINERAL2 corner plot (</w:t>
+      </w:r>
+      <m:oMath>
+        <m:r>
+          <m:t>K</m:t>
+        </m:r>
+        <m:r>
+          <m:rPr>
+            <m:sty m:val="p"/>
+          </m:rPr>
+          <m:t>=</m:t>
+        </m:r>
+        <m:r>
+          <m:t>4</m:t>
+        </m:r>
+      </m:oMath>
+      <w:r>
+        <w:t xml:space="preserve">,</w:t>
+      </w:r>
+      <w:r>
+        <w:t xml:space="preserve"> </w:t>
+      </w:r>
+      <m:oMath>
+        <m:r>
+          <m:t>N</m:t>
+        </m:r>
+        <m:r>
+          <m:rPr>
+            <m:sty m:val="p"/>
+          </m:rPr>
+          <m:t>=</m:t>
+        </m:r>
+        <m:r>
+          <m:t>20</m:t>
+        </m:r>
+      </m:oMath>
+      <w:r>
+        <w:t xml:space="preserve">). Top-5 most-discriminative</w:t>
+      </w:r>
+      <w:r>
+        <w:t xml:space="preserve"> </w:t>
+      </w:r>
+      <w:r>
+        <w:t xml:space="preserve">mineral abundances on the high-sulfidation epithermal mineralogy.</w:t>
+      </w:r>
+      <w:r>
+        <w:t xml:space="preserve"> </w:t>
+      </w:r>
+      <w:r>
+        <w:t xml:space="preserve">The alunite-pyrophyllite-illite block is the canonical lithocap motif</w:t>
+      </w:r>
+      <w:r>
+        <w:t xml:space="preserve"> </w:t>
+      </w:r>
+      <w:r>
+        <w:t xml:space="preserve">on porphyry-Cu systems.</w:t>
+      </w:r>
+    </w:p>
+    <w:bookmarkEnd w:id="56"/>
+    <w:bookmarkStart w:id="60" w:name="fig:corner-porphyry"/>
+    <w:p>
+      <w:pPr>
+        <w:pStyle w:val="CaptionedFigure"/>
+      </w:pPr>
+      <w:r>
+        <w:drawing>
+          <wp:inline>
+            <wp:extent cx="5334000" cy="5159523"/>
+            <wp:effectExtent b="0" l="0" r="0" t="0"/>
+            <wp:docPr descr="" title="" id="58" name="Picture"/>
+            <a:graphic>
+              <a:graphicData uri="http://schemas.openxmlformats.org/drawingml/2006/picture">
+                <pic:pic>
+                  <pic:nvPicPr>
+                    <pic:cNvPr descr="hidsag-corner-porphyry.pdf" id="59" name="Picture"/>
+                    <pic:cNvPicPr>
+                      <a:picLocks noChangeArrowheads="1" noChangeAspect="1"/>
+                    </pic:cNvPicPr>
+                  </pic:nvPicPr>
+                  <pic:blipFill>
+                    <a:blip r:embed="rId57"/>
+                    <a:stretch>
+                      <a:fillRect/>
+                    </a:stretch>
+                  </pic:blipFill>
+                  <pic:spPr bwMode="auto">
+                    <a:xfrm>
+                      <a:off x="0" y="0"/>
+                      <a:ext cx="5334000" cy="5159523"/>
+                    </a:xfrm>
+                    <a:prstGeom prst="rect">
+                      <a:avLst/>
+                    </a:prstGeom>
+                    <a:noFill/>
+                    <a:ln w="9525">
+                      <a:noFill/>
+                      <a:headEnd/>
+                      <a:tailEnd/>
+                    </a:ln>
+                  </pic:spPr>
+                </pic:pic>
+              </a:graphicData>
+            </a:graphic>
+          </wp:inline>
+        </w:drawing>
+      </w:r>
+    </w:p>
+    <w:p>
+      <w:pPr>
+        <w:pStyle w:val="ImageCaption"/>
+      </w:pPr>
+      <w:r>
+        <w:t xml:space="preserve">PORPHYRY corner plot (</w:t>
+      </w:r>
+      <m:oMath>
+        <m:r>
+          <m:t>K</m:t>
+        </m:r>
+        <m:r>
+          <m:rPr>
+            <m:sty m:val="p"/>
+          </m:rPr>
+          <m:t>=</m:t>
+        </m:r>
+        <m:r>
+          <m:t>6</m:t>
+        </m:r>
+      </m:oMath>
+      <w:r>
+        <w:t xml:space="preserve">,</w:t>
+      </w:r>
+      <w:r>
+        <w:t xml:space="preserve"> </w:t>
+      </w:r>
+      <m:oMath>
+        <m:r>
+          <m:t>N</m:t>
+        </m:r>
+        <m:r>
+          <m:rPr>
+            <m:sty m:val="p"/>
+          </m:rPr>
+          <m:t>=</m:t>
+        </m:r>
+        <m:r>
+          <m:t>56</m:t>
+        </m:r>
+      </m:oMath>
+      <w:r>
+        <w:t xml:space="preserve">). Auto-selected</w:t>
+      </w:r>
+      <w:r>
+        <w:t xml:space="preserve"> </w:t>
+      </w:r>
+      <w:r>
+        <w:t xml:space="preserve">top-5 most-discriminative mineral abundances (% biotite, %</w:t>
+      </w:r>
+      <w:r>
+        <w:t xml:space="preserve"> </w:t>
+      </w:r>
+      <w:r>
+        <w:t xml:space="preserve">molybdenite, % quartz, % pyrite, combined sulfide</w:t>
+      </w:r>
+      <w:r>
+        <w:t xml:space="preserve"> </w:t>
+      </w:r>
+      <w:r>
+        <w:t xml:space="preserve">[Cpy+Py+Bo]%). The Bt%-vs-Mb% panel surfaces the biotite-dominant</w:t>
+      </w:r>
+      <w:r>
+        <w:t xml:space="preserve"> </w:t>
+      </w:r>
+      <w:r>
+        <w:t xml:space="preserve">versus molybdenite-dominant topic families directly.</w:t>
+      </w:r>
+    </w:p>
+    <w:bookmarkEnd w:id="60"/>
+    <w:bookmarkEnd w:id="61"/>
+    <w:bookmarkStart w:id="66" w:name="porphyry-hammock-plot-topic-bt-mb-py"/>
+    <w:p>
+      <w:pPr>
+        <w:pStyle w:val="Heading1"/>
+      </w:pPr>
+      <w:r>
+        <w:t xml:space="preserve">PORPHYRY hammock plot — topic ↔ Bt% ↔ Mb% ↔ Py%</w:t>
+      </w:r>
+    </w:p>
+    <w:bookmarkStart w:id="65" w:name="fig:porphyry-hammock"/>
+    <w:p>
+      <w:pPr>
+        <w:pStyle w:val="CaptionedFigure"/>
+      </w:pPr>
+      <w:r>
+        <w:drawing>
+          <wp:inline>
+            <wp:extent cx="5334000" cy="2582436"/>
+            <wp:effectExtent b="0" l="0" r="0" t="0"/>
+            <wp:docPr descr="" title="" id="63" name="Picture"/>
+            <a:graphic>
+              <a:graphicData uri="http://schemas.openxmlformats.org/drawingml/2006/picture">
+                <pic:pic>
+                  <pic:nvPicPr>
+                    <pic:cNvPr descr="porphyry-hammock.pdf" id="64" name="Picture"/>
+                    <pic:cNvPicPr>
+                      <a:picLocks noChangeArrowheads="1" noChangeAspect="1"/>
+                    </pic:cNvPicPr>
+                  </pic:nvPicPr>
+                  <pic:blipFill>
+                    <a:blip r:embed="rId62"/>
+                    <a:stretch>
+                      <a:fillRect/>
+                    </a:stretch>
+                  </pic:blipFill>
+                  <pic:spPr bwMode="auto">
+                    <a:xfrm>
+                      <a:off x="0" y="0"/>
+                      <a:ext cx="5334000" cy="2582436"/>
+                    </a:xfrm>
+                    <a:prstGeom prst="rect">
+                      <a:avLst/>
+                    </a:prstGeom>
+                    <a:noFill/>
+                    <a:ln w="9525">
+                      <a:noFill/>
+                      <a:headEnd/>
+                      <a:tailEnd/>
+                    </a:ln>
+                  </pic:spPr>
+                </pic:pic>
+              </a:graphicData>
+            </a:graphic>
+          </wp:inline>
+        </w:drawing>
+      </w:r>
+    </w:p>
+    <w:p>
+      <w:pPr>
+        <w:pStyle w:val="ImageCaption"/>
+      </w:pPr>
+      <w:r>
+        <w:t xml:space="preserve">Hammock plot </w:t>
+      </w:r>
+      <w:r>
+        <w:t xml:space="preserve">(Schonlau 2025)</w:t>
+      </w:r>
+      <w:r>
+        <w:t xml:space="preserve"> </w:t>
+      </w:r>
+      <w:r>
+        <w:t xml:space="preserve">on PORPHYRY combining</w:t>
+      </w:r>
+      <w:r>
+        <w:t xml:space="preserve"> </w:t>
+      </w:r>
+      <w:r>
+        <w:t xml:space="preserve">the categorical</w:t>
+      </w:r>
+      <w:r>
+        <w:t xml:space="preserve"> </w:t>
+      </w:r>
+      <w:r>
+        <w:rPr>
+          <w:i/>
+          <w:iCs/>
+        </w:rPr>
+        <w:t xml:space="preserve">dominant topic</w:t>
+      </w:r>
+      <w:r>
+        <w:t xml:space="preserve"> </w:t>
+      </w:r>
+      <w:r>
+        <w:t xml:space="preserve">axis (</w:t>
+      </w:r>
+      <m:oMath>
+        <m:r>
+          <m:t>K</m:t>
+        </m:r>
+        <m:r>
+          <m:rPr>
+            <m:sty m:val="p"/>
+          </m:rPr>
+          <m:t>=</m:t>
+        </m:r>
+        <m:r>
+          <m:t>6</m:t>
+        </m:r>
+      </m:oMath>
+      <w:r>
+        <w:t xml:space="preserve">) with three</w:t>
+      </w:r>
+      <w:r>
+        <w:t xml:space="preserve"> </w:t>
+      </w:r>
+      <w:r>
+        <w:t xml:space="preserve">continuous mineralogical assays (% biotite, % molybdenite, %</w:t>
+      </w:r>
+      <w:r>
+        <w:t xml:space="preserve"> </w:t>
+      </w:r>
+      <w:r>
+        <w:t xml:space="preserve">pyrite). Continuous axes are binned into scene-wide quintiles</w:t>
+      </w:r>
+      <w:r>
+        <w:t xml:space="preserve"> </w:t>
+      </w:r>
+      <w:r>
+        <w:t xml:space="preserve">(</w:t>
+      </w:r>
+      <m:oMath>
+        <m:sSub>
+          <m:e>
+            <m:r>
+              <m:t>Q</m:t>
+            </m:r>
+          </m:e>
+          <m:sub>
+            <m:r>
+              <m:t>1</m:t>
+            </m:r>
+          </m:sub>
+        </m:sSub>
+      </m:oMath>
+      <w:r>
+        <w:t xml:space="preserve">..</w:t>
+      </w:r>
+      <m:oMath>
+        <m:sSub>
+          <m:e>
+            <m:r>
+              <m:t>Q</m:t>
+            </m:r>
+          </m:e>
+          <m:sub>
+            <m:r>
+              <m:t>5</m:t>
+            </m:r>
+          </m:sub>
+        </m:sSub>
+      </m:oMath>
+      <w:r>
+        <w:t xml:space="preserve">). Ribbon thickness = document count; topic-coloured</w:t>
+      </w:r>
+      <w:r>
+        <w:t xml:space="preserve"> </w:t>
+      </w:r>
+      <w:r>
+        <w:t xml:space="preserve">(tab10). The hammock idiom unifies mosaic plots</w:t>
+      </w:r>
+      <w:r>
+        <w:t xml:space="preserve"> </w:t>
+      </w:r>
+      <w:r>
+        <w:t xml:space="preserve">(categorical-only) and parallel-coordinates (continuous-only) on</w:t>
+      </w:r>
+      <w:r>
+        <w:t xml:space="preserve"> </w:t>
+      </w:r>
+      <w:r>
+        <w:t xml:space="preserve">the same diagram.</w:t>
+      </w:r>
+    </w:p>
+    <w:bookmarkEnd w:id="65"/>
+    <w:bookmarkEnd w:id="66"/>
+    <w:bookmarkStart w:id="71" w:name="Xf6f22159557e916daff64a8c5348fea5776d386"/>
+    <w:p>
+      <w:pPr>
+        <w:pStyle w:val="Heading1"/>
+      </w:pPr>
+      <w:r>
+        <w:t xml:space="preserve">Cross-method top-word</w:t>
+      </w:r>
+      <w:r>
+        <w:t xml:space="preserve"> </w:t>
+      </w:r>
+      <m:oMath>
+        <m:r>
+          <m:t>λ</m:t>
+        </m:r>
+      </m:oMath>
+      <w:r>
+        <w:t xml:space="preserve"> </w:t>
+      </w:r>
+      <w:r>
+        <w:t xml:space="preserve">comparison: LDA / ProdLDA / ETM</w:t>
+      </w:r>
+    </w:p>
+    <w:bookmarkStart w:id="70" w:name="fig:neural-words"/>
+    <w:p>
+      <w:pPr>
+        <w:pStyle w:val="CaptionedFigure"/>
+      </w:pPr>
+      <w:r>
+        <w:drawing>
+          <wp:inline>
+            <wp:extent cx="5334000" cy="3519139"/>
+            <wp:effectExtent b="0" l="0" r="0" t="0"/>
+            <wp:docPr descr="" title="" id="68" name="Picture"/>
+            <a:graphic>
+              <a:graphicData uri="http://schemas.openxmlformats.org/drawingml/2006/picture">
+                <pic:pic>
+                  <pic:nvPicPr>
+                    <pic:cNvPr descr="neural-topic-word-compare.pdf" id="69" name="Picture"/>
+                    <pic:cNvPicPr>
+                      <a:picLocks noChangeArrowheads="1" noChangeAspect="1"/>
+                    </pic:cNvPicPr>
+                  </pic:nvPicPr>
+                  <pic:blipFill>
+                    <a:blip r:embed="rId67"/>
+                    <a:stretch>
+                      <a:fillRect/>
+                    </a:stretch>
+                  </pic:blipFill>
+                  <pic:spPr bwMode="auto">
+                    <a:xfrm>
+                      <a:off x="0" y="0"/>
+                      <a:ext cx="5334000" cy="3519139"/>
+                    </a:xfrm>
+                    <a:prstGeom prst="rect">
+                      <a:avLst/>
+                    </a:prstGeom>
+                    <a:noFill/>
+                    <a:ln w="9525">
+                      <a:noFill/>
+                      <a:headEnd/>
+                      <a:tailEnd/>
+                    </a:ln>
+                  </pic:spPr>
+                </pic:pic>
+              </a:graphicData>
+            </a:graphic>
+          </wp:inline>
+        </w:drawing>
+      </w:r>
+    </w:p>
+    <w:p>
+      <w:pPr>
+        <w:pStyle w:val="ImageCaption"/>
+      </w:pPr>
+      <w:r>
+        <w:t xml:space="preserve">Cross-method top-word</w:t>
+      </w:r>
+      <w:r>
+        <w:t xml:space="preserve"> </w:t>
+      </w:r>
+      <m:oMath>
+        <m:r>
+          <m:t>λ</m:t>
+        </m:r>
+      </m:oMath>
+      <w:r>
+        <w:t xml:space="preserve"> </w:t>
+      </w:r>
+      <w:r>
+        <w:t xml:space="preserve">comparison on Indian Pines</w:t>
+      </w:r>
+      <w:r>
+        <w:t xml:space="preserve"> </w:t>
+      </w:r>
+      <w:r>
+        <w:t xml:space="preserve">(</w:t>
+      </w:r>
+      <m:oMath>
+        <m:r>
+          <m:t>K</m:t>
+        </m:r>
+        <m:r>
+          <m:rPr>
+            <m:sty m:val="p"/>
+          </m:rPr>
+          <m:t>=</m:t>
+        </m:r>
+        <m:r>
+          <m:t>12</m:t>
+        </m:r>
+      </m:oMath>
+      <w:r>
+        <w:t xml:space="preserve">). One panel per method (LDA, ProdLDA, ETM); each panel shows</w:t>
+      </w:r>
+      <w:r>
+        <w:t xml:space="preserve"> </w:t>
+      </w:r>
+      <m:oMath>
+        <m:r>
+          <m:t>K</m:t>
+        </m:r>
+      </m:oMath>
+      <w:r>
+        <w:t xml:space="preserve"> </w:t>
+      </w:r>
+      <w:r>
+        <w:t xml:space="preserve">rows of top-15-word wavelength tick marks. Complements the</w:t>
+      </w:r>
+      <w:r>
+        <w:t xml:space="preserve"> </w:t>
+      </w:r>
+      <w:r>
+        <w:t xml:space="preserve">coherence-vs-ARI scatter (which reports scalars) with the spectral</w:t>
+      </w:r>
+      <w:r>
+        <w:t xml:space="preserve"> </w:t>
+      </w:r>
+      <w:r>
+        <w:t xml:space="preserve">identity of each method’s basis: if LDA and ETM emphasise the same</w:t>
+      </w:r>
+      <w:r>
+        <w:t xml:space="preserve"> </w:t>
+      </w:r>
+      <w:r>
+        <w:t xml:space="preserve">wavelength bands but ProdLDA’s emphasis shifts, the shift</w:t>
+      </w:r>
+      <w:r>
+        <w:t xml:space="preserve"> </w:t>
+      </w:r>
+      <w:r>
+        <w:rPr>
+          <w:i/>
+          <w:iCs/>
+        </w:rPr>
+        <w:t xml:space="preserve">is</w:t>
+      </w:r>
+      <w:r>
+        <w:t xml:space="preserve"> </w:t>
+      </w:r>
+      <w:r>
+        <w:t xml:space="preserve">the interpretability difference.</w:t>
+      </w:r>
+    </w:p>
+    <w:bookmarkEnd w:id="70"/>
+    <w:bookmarkEnd w:id="71"/>
+    <w:bookmarkStart w:id="93" w:name="why-these-thirteen-figures"/>
+    <w:p>
+      <w:pPr>
+        <w:pStyle w:val="Heading1"/>
+      </w:pPr>
+      <w:r>
+        <w:t xml:space="preserve">Why these thirteen figures</w:t>
       </w:r>
     </w:p>
     <w:p>
@@ -2029,13 +2620,13 @@
         <w:pStyle w:val="FirstParagraph"/>
       </w:pPr>
       <w:r>
-        <w:t xml:space="preserve">The nine figures answer nine distinct cognitive questions about the</w:t>
-      </w:r>
-      <w:r>
-        <w:t xml:space="preserve"> </w:t>
-      </w:r>
-      <w:r>
-        <w:t xml:space="preserve">topic–label and topic–measurement relationships:</w:t>
+        <w:t xml:space="preserve">The thirteen figures answer thirteen distinct cognitive questions</w:t>
+      </w:r>
+      <w:r>
+        <w:t xml:space="preserve"> </w:t>
+      </w:r>
+      <w:r>
+        <w:t xml:space="preserve">about the topic–label and topic–measurement relationships:</w:t>
       </w:r>
     </w:p>
     <w:p>
@@ -2371,6 +2962,142 @@
     </w:p>
     <w:p>
       <w:pPr>
+        <w:numPr>
+          <w:ilvl w:val="0"/>
+          <w:numId w:val="1001"/>
+        </w:numPr>
+      </w:pPr>
+      <w:r>
+        <w:t xml:space="preserve">MINERAL2 corner (Fig. </w:t>
+      </w:r>
+      <w:hyperlink w:anchor="fig:corner-mineral2">
+        <w:r>
+          <w:rPr>
+            <w:rStyle w:val="Hyperlink"/>
+          </w:rPr>
+          <w:t xml:space="preserve">10</w:t>
+        </w:r>
+      </w:hyperlink>
+      <w:r>
+        <w:t xml:space="preserve">) —</w:t>
+      </w:r>
+      <w:r>
+        <w:t xml:space="preserve"> </w:t>
+      </w:r>
+      <w:r>
+        <w:t xml:space="preserve">“does</w:t>
+      </w:r>
+      <w:r>
+        <w:t xml:space="preserve"> </w:t>
+      </w:r>
+      <w:r>
+        <w:t xml:space="preserve">the high-sulfidation epithermal mineralogy separate by topic?”</w:t>
+      </w:r>
+    </w:p>
+    <w:p>
+      <w:pPr>
+        <w:numPr>
+          <w:ilvl w:val="0"/>
+          <w:numId w:val="1001"/>
+        </w:numPr>
+      </w:pPr>
+      <w:r>
+        <w:t xml:space="preserve">PORPHYRY corner (Fig. </w:t>
+      </w:r>
+      <w:hyperlink w:anchor="fig:corner-porphyry">
+        <w:r>
+          <w:rPr>
+            <w:rStyle w:val="Hyperlink"/>
+          </w:rPr>
+          <w:t xml:space="preserve">11</w:t>
+        </w:r>
+      </w:hyperlink>
+      <w:r>
+        <w:t xml:space="preserve">) —</w:t>
+      </w:r>
+      <w:r>
+        <w:t xml:space="preserve"> </w:t>
+      </w:r>
+      <w:r>
+        <w:t xml:space="preserve">“does</w:t>
+      </w:r>
+      <w:r>
+        <w:t xml:space="preserve"> </w:t>
+      </w:r>
+      <w:r>
+        <w:t xml:space="preserve">the porphyry-Cu signature separate by topic?”</w:t>
+      </w:r>
+    </w:p>
+    <w:p>
+      <w:pPr>
+        <w:numPr>
+          <w:ilvl w:val="0"/>
+          <w:numId w:val="1001"/>
+        </w:numPr>
+      </w:pPr>
+      <w:r>
+        <w:t xml:space="preserve">PORPHYRY hammock (Fig. </w:t>
+      </w:r>
+      <w:hyperlink w:anchor="fig:porphyry-hammock">
+        <w:r>
+          <w:rPr>
+            <w:rStyle w:val="Hyperlink"/>
+          </w:rPr>
+          <w:t xml:space="preserve">12</w:t>
+        </w:r>
+      </w:hyperlink>
+      <w:r>
+        <w:t xml:space="preserve">) —</w:t>
+      </w:r>
+      <w:r>
+        <w:t xml:space="preserve"> </w:t>
+      </w:r>
+      <w:r>
+        <w:t xml:space="preserve">“how</w:t>
+      </w:r>
+      <w:r>
+        <w:t xml:space="preserve"> </w:t>
+      </w:r>
+      <w:r>
+        <w:t xml:space="preserve">does the joint distribution over topic + 3 assays decompose?”</w:t>
+      </w:r>
+    </w:p>
+    <w:p>
+      <w:pPr>
+        <w:numPr>
+          <w:ilvl w:val="0"/>
+          <w:numId w:val="1001"/>
+        </w:numPr>
+      </w:pPr>
+      <w:r>
+        <w:t xml:space="preserve">Cross-method words (Fig. </w:t>
+      </w:r>
+      <w:hyperlink w:anchor="fig:neural-words">
+        <w:r>
+          <w:rPr>
+            <w:rStyle w:val="Hyperlink"/>
+          </w:rPr>
+          <w:t xml:space="preserve">13</w:t>
+        </w:r>
+      </w:hyperlink>
+      <w:r>
+        <w:t xml:space="preserve">) —</w:t>
+      </w:r>
+      <w:r>
+        <w:t xml:space="preserve"> </w:t>
+      </w:r>
+      <w:r>
+        <w:t xml:space="preserve">“do</w:t>
+      </w:r>
+      <w:r>
+        <w:t xml:space="preserve"> </w:t>
+      </w:r>
+      <w:r>
+        <w:t xml:space="preserve">LDA / ProdLDA / ETM emphasise the same spectral bands?”</w:t>
+      </w:r>
+    </w:p>
+    <w:p>
+      <w:pPr>
         <w:pStyle w:val="FirstParagraph"/>
       </w:pPr>
       <w:r>
@@ -2410,8 +3137,8 @@
         <w:t xml:space="preserve">for the full literature survey that informed the selection.</w:t>
       </w:r>
     </w:p>
-    <w:bookmarkStart w:id="71" w:name="refs"/>
-    <w:bookmarkStart w:id="54" w:name="ref-datatovizSankey"/>
+    <w:bookmarkStart w:id="92" w:name="refs"/>
+    <w:bookmarkStart w:id="73" w:name="ref-datatovizSankey"/>
     <w:p>
       <w:pPr>
         <w:pStyle w:val="Bibliography"/>
@@ -2435,7 +3162,7 @@
       <w:r>
         <w:t xml:space="preserve"> </w:t>
       </w:r>
-      <w:hyperlink r:id="rId53">
+      <w:hyperlink r:id="rId72">
         <w:r>
           <w:rPr>
             <w:rStyle w:val="Hyperlink"/>
@@ -2447,8 +3174,8 @@
         <w:t xml:space="preserve">.</w:t>
       </w:r>
     </w:p>
-    <w:bookmarkEnd w:id="54"/>
-    <w:bookmarkStart w:id="56" w:name="ref-hidsag2023figshare"/>
+    <w:bookmarkEnd w:id="73"/>
+    <w:bookmarkStart w:id="75" w:name="ref-hidsag2023figshare"/>
     <w:p>
       <w:pPr>
         <w:pStyle w:val="Bibliography"/>
@@ -2479,7 +3206,7 @@
       <w:r>
         <w:t xml:space="preserve"> </w:t>
       </w:r>
-      <w:hyperlink r:id="rId55">
+      <w:hyperlink r:id="rId74">
         <w:r>
           <w:rPr>
             <w:rStyle w:val="Hyperlink"/>
@@ -2493,7 +3220,7 @@
       <w:r>
         <w:t xml:space="preserve"> </w:t>
       </w:r>
-      <w:hyperlink r:id="rId55">
+      <w:hyperlink r:id="rId74">
         <w:r>
           <w:rPr>
             <w:rStyle w:val="Hyperlink"/>
@@ -2505,8 +3232,8 @@
         <w:t xml:space="preserve">.</w:t>
       </w:r>
     </w:p>
-    <w:bookmarkEnd w:id="56"/>
-    <w:bookmarkStart w:id="58" w:name="ref-hidsag2023"/>
+    <w:bookmarkEnd w:id="75"/>
+    <w:bookmarkStart w:id="77" w:name="ref-hidsag2023"/>
     <w:p>
       <w:pPr>
         <w:pStyle w:val="Bibliography"/>
@@ -2545,7 +3272,7 @@
       <w:r>
         <w:t xml:space="preserve"> </w:t>
       </w:r>
-      <w:hyperlink r:id="rId57">
+      <w:hyperlink r:id="rId76">
         <w:r>
           <w:rPr>
             <w:rStyle w:val="Hyperlink"/>
@@ -2557,8 +3284,8 @@
         <w:t xml:space="preserve">.</w:t>
       </w:r>
     </w:p>
-    <w:bookmarkEnd w:id="58"/>
-    <w:bookmarkStart w:id="60" w:name="ref-foremanmackey2016corner"/>
+    <w:bookmarkEnd w:id="77"/>
+    <w:bookmarkStart w:id="79" w:name="ref-foremanmackey2016corner"/>
     <w:p>
       <w:pPr>
         <w:pStyle w:val="Bibliography"/>
@@ -2600,7 +3327,7 @@
       <w:r>
         <w:t xml:space="preserve"> </w:t>
       </w:r>
-      <w:hyperlink r:id="rId59">
+      <w:hyperlink r:id="rId78">
         <w:r>
           <w:rPr>
             <w:rStyle w:val="Hyperlink"/>
@@ -2612,8 +3339,8 @@
         <w:t xml:space="preserve">.</w:t>
       </w:r>
     </w:p>
-    <w:bookmarkEnd w:id="60"/>
-    <w:bookmarkStart w:id="62" w:name="ref-friendly1994mosaic"/>
+    <w:bookmarkEnd w:id="79"/>
+    <w:bookmarkStart w:id="81" w:name="ref-friendly1994mosaic"/>
     <w:p>
       <w:pPr>
         <w:pStyle w:val="Bibliography"/>
@@ -2646,7 +3373,7 @@
       <w:r>
         <w:t xml:space="preserve"> </w:t>
       </w:r>
-      <w:hyperlink r:id="rId61">
+      <w:hyperlink r:id="rId80">
         <w:r>
           <w:rPr>
             <w:rStyle w:val="Hyperlink"/>
@@ -2658,8 +3385,8 @@
         <w:t xml:space="preserve">.</w:t>
       </w:r>
     </w:p>
-    <w:bookmarkEnd w:id="62"/>
-    <w:bookmarkStart w:id="64" w:name="ref-hintze1998violin"/>
+    <w:bookmarkEnd w:id="81"/>
+    <w:bookmarkStart w:id="83" w:name="ref-hintze1998violin"/>
     <w:p>
       <w:pPr>
         <w:pStyle w:val="Bibliography"/>
@@ -2692,7 +3419,7 @@
       <w:r>
         <w:t xml:space="preserve"> </w:t>
       </w:r>
-      <w:hyperlink r:id="rId63">
+      <w:hyperlink r:id="rId82">
         <w:r>
           <w:rPr>
             <w:rStyle w:val="Hyperlink"/>
@@ -2704,8 +3431,8 @@
         <w:t xml:space="preserve">.</w:t>
       </w:r>
     </w:p>
-    <w:bookmarkEnd w:id="64"/>
-    <w:bookmarkStart w:id="66" w:name="ref-hofmann2008mosaic"/>
+    <w:bookmarkEnd w:id="83"/>
+    <w:bookmarkStart w:id="85" w:name="ref-hofmann2008mosaic"/>
     <w:p>
       <w:pPr>
         <w:pStyle w:val="Bibliography"/>
@@ -2741,7 +3468,7 @@
       <w:r>
         <w:t xml:space="preserve"> </w:t>
       </w:r>
-      <w:hyperlink r:id="rId65">
+      <w:hyperlink r:id="rId84">
         <w:r>
           <w:rPr>
             <w:rStyle w:val="Hyperlink"/>
@@ -2753,8 +3480,8 @@
         <w:t xml:space="preserve">.</w:t>
       </w:r>
     </w:p>
-    <w:bookmarkEnd w:id="66"/>
-    <w:bookmarkStart w:id="68" w:name="ref-matplotlibConfidenceEllipse"/>
+    <w:bookmarkEnd w:id="85"/>
+    <w:bookmarkStart w:id="87" w:name="ref-matplotlibConfidenceEllipse"/>
     <w:p>
       <w:pPr>
         <w:pStyle w:val="Bibliography"/>
@@ -2778,7 +3505,7 @@
       <w:r>
         <w:t xml:space="preserve"> </w:t>
       </w:r>
-      <w:hyperlink r:id="rId67">
+      <w:hyperlink r:id="rId86">
         <w:r>
           <w:rPr>
             <w:rStyle w:val="Hyperlink"/>
@@ -2790,8 +3517,51 @@
         <w:t xml:space="preserve">.</w:t>
       </w:r>
     </w:p>
-    <w:bookmarkEnd w:id="68"/>
-    <w:bookmarkStart w:id="70" w:name="ref-wilke2017ggridges"/>
+    <w:bookmarkEnd w:id="87"/>
+    <w:bookmarkStart w:id="89" w:name="ref-schonlau2025hammock"/>
+    <w:p>
+      <w:pPr>
+        <w:pStyle w:val="Bibliography"/>
+      </w:pPr>
+      <w:r>
+        <w:t xml:space="preserve">Schonlau, Matthias. 2025.</w:t>
+      </w:r>
+      <w:r>
+        <w:t xml:space="preserve"> </w:t>
+      </w:r>
+      <w:r>
+        <w:t xml:space="preserve">“Hammock Plot for Mixed Numerical and Categorical Variables.”</w:t>
+      </w:r>
+      <w:r>
+        <w:t xml:space="preserve"> </w:t>
+      </w:r>
+      <w:r>
+        <w:rPr>
+          <w:i/>
+          <w:iCs/>
+        </w:rPr>
+        <w:t xml:space="preserve">arXiv Preprint arXiv:2506.13630</w:t>
+      </w:r>
+      <w:r>
+        <w:t xml:space="preserve">.</w:t>
+      </w:r>
+      <w:r>
+        <w:t xml:space="preserve"> </w:t>
+      </w:r>
+      <w:hyperlink r:id="rId88">
+        <w:r>
+          <w:rPr>
+            <w:rStyle w:val="Hyperlink"/>
+          </w:rPr>
+          <w:t xml:space="preserve">https://arxiv.org/abs/2506.13630</w:t>
+        </w:r>
+      </w:hyperlink>
+      <w:r>
+        <w:t xml:space="preserve">.</w:t>
+      </w:r>
+    </w:p>
+    <w:bookmarkEnd w:id="89"/>
+    <w:bookmarkStart w:id="91" w:name="ref-wilke2017ggridges"/>
     <w:p>
       <w:pPr>
         <w:pStyle w:val="Bibliography"/>
@@ -2829,7 +3599,7 @@
       <w:r>
         <w:t xml:space="preserve"> </w:t>
       </w:r>
-      <w:hyperlink r:id="rId69">
+      <w:hyperlink r:id="rId90">
         <w:r>
           <w:rPr>
             <w:rStyle w:val="Hyperlink"/>
@@ -2841,9 +3611,9 @@
         <w:t xml:space="preserve">.</w:t>
       </w:r>
     </w:p>
-    <w:bookmarkEnd w:id="70"/>
-    <w:bookmarkEnd w:id="71"/>
-    <w:bookmarkEnd w:id="72"/>
+    <w:bookmarkEnd w:id="91"/>
+    <w:bookmarkEnd w:id="92"/>
+    <w:bookmarkEnd w:id="93"/>
     <w:sectPr>
       <w:footnotePr>
         <w:numRestart w:val="eachSect"/>

</xml_diff>